<commit_message>
Insert emulator screenshots and Logcat figures into reports
Screenshots captured by the android/ 'screenshots' task are moved to
screenshots/; tools/prepare_images.py renders each app's own Logcat
lines and crops screens, and the generator places them as numbered
figures.

Co-Authored-By: Claude Opus 5.5 <noreply@anthropic.com>
Claude-Session: https://claude.ai/code/session_01KeeuK4qVpzTPDQXDYVJKg1
</commit_message>
<xml_diff>
--- a/задания/Задание 13 Виджеты и слушатели/Задание 13 Виджеты и слушатели.docx
+++ b/задания/Задание 13 Виджеты и слушатели/Задание 13 Виджеты и слушатели.docx
@@ -5884,6 +5884,334 @@
       <w:r>
         <w:t xml:space="preserve">Свитч скрывает и снова показывает текст.</w:t>
       </w:r>
+    </w:p>
+    <w:tbl>
+      <w:tblPr>
+        <w:tblW w:type="dxa" w:w="9354"/>
+        <w:tblBorders>
+          <w:top w:val="single" w:color="auto" w:sz="4"/>
+          <w:left w:val="single" w:color="auto" w:sz="4"/>
+          <w:bottom w:val="single" w:color="auto" w:sz="4"/>
+          <w:right w:val="single" w:color="auto" w:sz="4"/>
+          <w:insideH w:val="single" w:color="auto" w:sz="4"/>
+          <w:insideV w:val="single" w:color="auto" w:sz="4"/>
+        </w:tblBorders>
+      </w:tblPr>
+      <w:tblGrid>
+        <w:gridCol w:w="4677"/>
+        <w:gridCol w:w="4677"/>
+      </w:tblGrid>
+      <w:tr>
+        <w:trPr>
+          <w:cantSplit/>
+        </w:trPr>
+        <w:tc>
+          <w:tcPr>
+            <w:tcW w:type="dxa" w:w="4677"/>
+            <w:tcBorders>
+              <w:top w:val="none" w:color="FFFFFF" w:sz="0"/>
+              <w:left w:val="none" w:color="FFFFFF" w:sz="0"/>
+              <w:bottom w:val="none" w:color="FFFFFF" w:sz="0"/>
+              <w:right w:val="none" w:color="FFFFFF" w:sz="0"/>
+            </w:tcBorders>
+            <w:tcMar>
+              <w:left w:type="dxa" w:w="60"/>
+              <w:right w:type="dxa" w:w="60"/>
+            </w:tcMar>
+          </w:tcPr>
+          <w:p>
+            <w:pPr>
+              <w:spacing w:line="240" w:lineRule="auto"/>
+              <w:jc w:val="center"/>
+            </w:pPr>
+            <w:r>
+              <w:drawing>
+                <wp:inline distT="0" distB="0" distL="0" distR="0">
+                  <wp:extent cx="2828925" cy="3924300"/>
+                  <wp:effectExtent t="0" r="0" b="0" l="0"/>
+                  <wp:docPr id="1" name="" descr="" title=""/>
+                  <wp:cNvGraphicFramePr>
+                    <a:graphicFrameLocks xmlns:a="http://schemas.openxmlformats.org/drawingml/2006/main" noChangeAspect="1"/>
+                  </wp:cNvGraphicFramePr>
+                  <a:graphic xmlns:a="http://schemas.openxmlformats.org/drawingml/2006/main">
+                    <a:graphicData uri="http://schemas.openxmlformats.org/drawingml/2006/picture">
+                      <pic:pic xmlns:pic="http://schemas.openxmlformats.org/drawingml/2006/picture">
+                        <pic:nvPicPr>
+                          <pic:cNvPr id="0" name="" descr=""/>
+                          <pic:cNvPicPr>
+                            <a:picLocks noChangeAspect="1" noChangeArrowheads="1"/>
+                          </pic:cNvPicPr>
+                        </pic:nvPicPr>
+                        <pic:blipFill>
+                          <a:blip r:embed="rId8" cstate="none"/>
+                          <a:srcRect/>
+                          <a:stretch>
+                            <a:fillRect/>
+                          </a:stretch>
+                        </pic:blipFill>
+                        <pic:spPr bwMode="auto">
+                          <a:xfrm>
+                            <a:off x="0" y="0"/>
+                            <a:ext cx="2828925" cy="3924300"/>
+                          </a:xfrm>
+                          <a:prstGeom prst="rect">
+                            <a:avLst/>
+                          </a:prstGeom>
+                        </pic:spPr>
+                      </pic:pic>
+                    </a:graphicData>
+                  </a:graphic>
+                </wp:inline>
+              </w:drawing>
+            </w:r>
+          </w:p>
+          <w:p>
+            <w:pPr>
+              <w:spacing w:after="160" w:before="60" w:line="240"/>
+              <w:jc w:val="center"/>
+            </w:pPr>
+            <w:r>
+              <w:rPr>
+                <w:sz w:val="22"/>
+                <w:szCs w:val="22"/>
+              </w:rPr>
+              <w:t xml:space="preserve">Рисунок 1 — запуск</w:t>
+            </w:r>
+          </w:p>
+        </w:tc>
+        <w:tc>
+          <w:tcPr>
+            <w:tcW w:type="dxa" w:w="4677"/>
+            <w:tcBorders>
+              <w:top w:val="none" w:color="FFFFFF" w:sz="0"/>
+              <w:left w:val="none" w:color="FFFFFF" w:sz="0"/>
+              <w:bottom w:val="none" w:color="FFFFFF" w:sz="0"/>
+              <w:right w:val="none" w:color="FFFFFF" w:sz="0"/>
+            </w:tcBorders>
+            <w:tcMar>
+              <w:left w:type="dxa" w:w="60"/>
+              <w:right w:type="dxa" w:w="60"/>
+            </w:tcMar>
+          </w:tcPr>
+          <w:p>
+            <w:pPr>
+              <w:spacing w:line="240" w:lineRule="auto"/>
+              <w:jc w:val="center"/>
+            </w:pPr>
+            <w:r>
+              <w:drawing>
+                <wp:inline distT="0" distB="0" distL="0" distR="0">
+                  <wp:extent cx="2828925" cy="3924300"/>
+                  <wp:effectExtent t="0" r="0" b="0" l="0"/>
+                  <wp:docPr id="1" name="" descr="" title=""/>
+                  <wp:cNvGraphicFramePr>
+                    <a:graphicFrameLocks xmlns:a="http://schemas.openxmlformats.org/drawingml/2006/main" noChangeAspect="1"/>
+                  </wp:cNvGraphicFramePr>
+                  <a:graphic xmlns:a="http://schemas.openxmlformats.org/drawingml/2006/main">
+                    <a:graphicData uri="http://schemas.openxmlformats.org/drawingml/2006/picture">
+                      <pic:pic xmlns:pic="http://schemas.openxmlformats.org/drawingml/2006/picture">
+                        <pic:nvPicPr>
+                          <pic:cNvPr id="0" name="" descr=""/>
+                          <pic:cNvPicPr>
+                            <a:picLocks noChangeAspect="1" noChangeArrowheads="1"/>
+                          </pic:cNvPicPr>
+                        </pic:nvPicPr>
+                        <pic:blipFill>
+                          <a:blip r:embed="rId9" cstate="none"/>
+                          <a:srcRect/>
+                          <a:stretch>
+                            <a:fillRect/>
+                          </a:stretch>
+                        </pic:blipFill>
+                        <pic:spPr bwMode="auto">
+                          <a:xfrm>
+                            <a:off x="0" y="0"/>
+                            <a:ext cx="2828925" cy="3924300"/>
+                          </a:xfrm>
+                          <a:prstGeom prst="rect">
+                            <a:avLst/>
+                          </a:prstGeom>
+                        </pic:spPr>
+                      </pic:pic>
+                    </a:graphicData>
+                  </a:graphic>
+                </wp:inline>
+              </w:drawing>
+            </w:r>
+          </w:p>
+          <w:p>
+            <w:pPr>
+              <w:spacing w:after="160" w:before="60" w:line="240"/>
+              <w:jc w:val="center"/>
+            </w:pPr>
+            <w:r>
+              <w:rPr>
+                <w:sz w:val="22"/>
+                <w:szCs w:val="22"/>
+              </w:rPr>
+              <w:t xml:space="preserve">Рисунок 2 — «Прозрачность», «Увеличение», «Красный»</w:t>
+            </w:r>
+          </w:p>
+        </w:tc>
+      </w:tr>
+      <w:tr>
+        <w:trPr>
+          <w:cantSplit/>
+        </w:trPr>
+        <w:tc>
+          <w:tcPr>
+            <w:tcW w:type="dxa" w:w="4677"/>
+            <w:tcBorders>
+              <w:top w:val="none" w:color="FFFFFF" w:sz="0"/>
+              <w:left w:val="none" w:color="FFFFFF" w:sz="0"/>
+              <w:bottom w:val="none" w:color="FFFFFF" w:sz="0"/>
+              <w:right w:val="none" w:color="FFFFFF" w:sz="0"/>
+            </w:tcBorders>
+            <w:tcMar>
+              <w:left w:type="dxa" w:w="60"/>
+              <w:right w:type="dxa" w:w="60"/>
+            </w:tcMar>
+          </w:tcPr>
+          <w:p>
+            <w:pPr>
+              <w:spacing w:line="240" w:lineRule="auto"/>
+              <w:jc w:val="center"/>
+            </w:pPr>
+            <w:r>
+              <w:drawing>
+                <wp:inline distT="0" distB="0" distL="0" distR="0">
+                  <wp:extent cx="2828925" cy="3924300"/>
+                  <wp:effectExtent t="0" r="0" b="0" l="0"/>
+                  <wp:docPr id="1" name="" descr="" title=""/>
+                  <wp:cNvGraphicFramePr>
+                    <a:graphicFrameLocks xmlns:a="http://schemas.openxmlformats.org/drawingml/2006/main" noChangeAspect="1"/>
+                  </wp:cNvGraphicFramePr>
+                  <a:graphic xmlns:a="http://schemas.openxmlformats.org/drawingml/2006/main">
+                    <a:graphicData uri="http://schemas.openxmlformats.org/drawingml/2006/picture">
+                      <pic:pic xmlns:pic="http://schemas.openxmlformats.org/drawingml/2006/picture">
+                        <pic:nvPicPr>
+                          <pic:cNvPr id="0" name="" descr=""/>
+                          <pic:cNvPicPr>
+                            <a:picLocks noChangeAspect="1" noChangeArrowheads="1"/>
+                          </pic:cNvPicPr>
+                        </pic:nvPicPr>
+                        <pic:blipFill>
+                          <a:blip r:embed="rId10" cstate="none"/>
+                          <a:srcRect/>
+                          <a:stretch>
+                            <a:fillRect/>
+                          </a:stretch>
+                        </pic:blipFill>
+                        <pic:spPr bwMode="auto">
+                          <a:xfrm>
+                            <a:off x="0" y="0"/>
+                            <a:ext cx="2828925" cy="3924300"/>
+                          </a:xfrm>
+                          <a:prstGeom prst="rect">
+                            <a:avLst/>
+                          </a:prstGeom>
+                        </pic:spPr>
+                      </pic:pic>
+                    </a:graphicData>
+                  </a:graphic>
+                </wp:inline>
+              </w:drawing>
+            </w:r>
+          </w:p>
+          <w:p>
+            <w:pPr>
+              <w:spacing w:after="160" w:before="60" w:line="240"/>
+              <w:jc w:val="center"/>
+            </w:pPr>
+            <w:r>
+              <w:rPr>
+                <w:sz w:val="22"/>
+                <w:szCs w:val="22"/>
+              </w:rPr>
+              <w:t xml:space="preserve">Рисунок 3 — «Синий», текст скопирован</w:t>
+            </w:r>
+          </w:p>
+        </w:tc>
+        <w:tc>
+          <w:tcPr>
+            <w:tcW w:type="dxa" w:w="4677"/>
+            <w:tcBorders>
+              <w:top w:val="none" w:color="FFFFFF" w:sz="0"/>
+              <w:left w:val="none" w:color="FFFFFF" w:sz="0"/>
+              <w:bottom w:val="none" w:color="FFFFFF" w:sz="0"/>
+              <w:right w:val="none" w:color="FFFFFF" w:sz="0"/>
+            </w:tcBorders>
+            <w:tcMar>
+              <w:left w:type="dxa" w:w="60"/>
+              <w:right w:type="dxa" w:w="60"/>
+            </w:tcMar>
+          </w:tcPr>
+          <w:p>
+            <w:pPr>
+              <w:spacing w:line="240" w:lineRule="auto"/>
+              <w:jc w:val="center"/>
+            </w:pPr>
+            <w:r>
+              <w:drawing>
+                <wp:inline distT="0" distB="0" distL="0" distR="0">
+                  <wp:extent cx="2828925" cy="3924300"/>
+                  <wp:effectExtent t="0" r="0" b="0" l="0"/>
+                  <wp:docPr id="1" name="" descr="" title=""/>
+                  <wp:cNvGraphicFramePr>
+                    <a:graphicFrameLocks xmlns:a="http://schemas.openxmlformats.org/drawingml/2006/main" noChangeAspect="1"/>
+                  </wp:cNvGraphicFramePr>
+                  <a:graphic xmlns:a="http://schemas.openxmlformats.org/drawingml/2006/main">
+                    <a:graphicData uri="http://schemas.openxmlformats.org/drawingml/2006/picture">
+                      <pic:pic xmlns:pic="http://schemas.openxmlformats.org/drawingml/2006/picture">
+                        <pic:nvPicPr>
+                          <pic:cNvPr id="0" name="" descr=""/>
+                          <pic:cNvPicPr>
+                            <a:picLocks noChangeAspect="1" noChangeArrowheads="1"/>
+                          </pic:cNvPicPr>
+                        </pic:nvPicPr>
+                        <pic:blipFill>
+                          <a:blip r:embed="rId11" cstate="none"/>
+                          <a:srcRect/>
+                          <a:stretch>
+                            <a:fillRect/>
+                          </a:stretch>
+                        </pic:blipFill>
+                        <pic:spPr bwMode="auto">
+                          <a:xfrm>
+                            <a:off x="0" y="0"/>
+                            <a:ext cx="2828925" cy="3924300"/>
+                          </a:xfrm>
+                          <a:prstGeom prst="rect">
+                            <a:avLst/>
+                          </a:prstGeom>
+                        </pic:spPr>
+                      </pic:pic>
+                    </a:graphicData>
+                  </a:graphic>
+                </wp:inline>
+              </w:drawing>
+            </w:r>
+          </w:p>
+          <w:p>
+            <w:pPr>
+              <w:spacing w:after="160" w:before="60" w:line="240"/>
+              <w:jc w:val="center"/>
+            </w:pPr>
+            <w:r>
+              <w:rPr>
+                <w:sz w:val="22"/>
+                <w:szCs w:val="22"/>
+              </w:rPr>
+              <w:t xml:space="preserve">Рисунок 4 — Switch выключен — текст скрыт</w:t>
+            </w:r>
+          </w:p>
+        </w:tc>
+      </w:tr>
+    </w:tbl>
+    <w:p>
+      <w:pPr>
+        <w:spacing w:after="80"/>
+      </w:pPr>
     </w:p>
     <w:sectPr>
       <w:footerReference w:type="default" r:id="rId7"/>
@@ -6143,7 +6471,7 @@
     </w:rPrDefault>
     <w:pPrDefault>
       <w:pPr>
-        <w:spacing w:line="276"/>
+        <w:spacing w:line="276" w:lineRule="auto"/>
       </w:pPr>
     </w:pPrDefault>
   </w:docDefaults>

</xml_diff>